<commit_message>
docs(paper): condense full paper to ten pages total
</commit_message>
<xml_diff>
--- a/paper/drafts/track2_full_paper.docx
+++ b/paper/drafts/track2_full_paper.docx
@@ -108,7 +108,7 @@
           <w:b w:val="0"/>
           <w:i w:val="0"/>
         </w:rPr>
-        <w:t>Our data come from the Copernicus Interactive Climate Atlas (https://atlas.climate.copernicus.eu/, version v2.5), produced by the Copernicus Climate Change Service (C3S). The Atlas is built on the gridded dataset that C3S publishes on the Climate Data Store (C3S, 2024b). We downloaded the series through the Atlas's regional-information export on 29 October 2026. All series come from ERA5-Land, a land-surface reanalysis that ECMWF produces for C3S by re-running the land component of the ERA5 model on a 0.1° regular grid; the Atlas retains this native resolution (C3S, 2023). We study four European countries along a south-north gradient: Spain, France, Germany and Sweden. Every series is annual and covers 1950 to 2025, giving 76 observations per series. A validation script (scripts/check_raw.py) confirms that all 16 files share the same Atlas version and dataset, that each year from 1950 to 2025 appears exactly once, and that no observation is missing. We therefore carry out no imputation or interpolation. The label "1961-1990" in the file headers refers to the period the Atlas highlights in its charts; it does not restrict the data.</w:t>
+        <w:t>We use the Copernicus Interactive Climate Atlas v2.5, produced by the Copernicus Climate Change Service (C3S), with regional-information exports downloaded on 29 October 2026. The underlying dataset is ERA5-Land, ECMWF's land-surface reanalysis on a 0.1° grid (C3S, 2023; 2024b). The four countries, Spain, France, Germany and Sweden, span southern to northern Europe. All 16 downloaded series cover 1950-2025, with 76 annual observations each. The raw-data check confirms common dataset and version labels, complete coverage, unique years and no missing values. We perform no imputation or interpolation. The 1961-1990 label in the file headers identifies the Atlas chart baseline, not the downloaded coverage.</w:t>
       </w:r>
     </w:p>
     <w:p>
@@ -117,7 +117,7 @@
           <w:b w:val="0"/>
           <w:i w:val="0"/>
         </w:rPr>
-        <w:t>We use two indices. The first, TXx, is the monthly maximum of daily maximum near-surface air temperature, in degrees Celsius. In each grid cell, the daily maximum is the highest of the hourly 2 m temperatures of that day, and the Atlas takes the highest of these daily maxima in a given month (C3S, 2023). It then averages these cell values over the country's territory, weighting each cell of the regular latitude-longitude grid by the cosine of its latitude; since ERA5-Land covers land only, sea cells do not enter the average (C3S, 2024a). Our country-level TXx is therefore the average across the country of each location's hottest day of the month, not the single hottest value recorded anywhere in the country. We use TXx for June, July and August. Pooling the three summer months gives 90 observations per 30-year period instead of the 30 that a single month would provide. This matters because our question concerns the tails of the distribution, which are poorly estimated in small samples. The cost is that the three months are not independent draws from one distribution, as August is typically hotter than June. Any pooled comparison must allow for this seasonal difference.</w:t>
+        <w:t>TXx is the monthly maximum of daily maximum near-surface temperature, in °C. Within each grid cell, the daily maximum is the highest hourly 2 m temperature; the Atlas then takes the month's highest daily value (C3S, 2023). Country averages weight land cells by cosine latitude (C3S, 2024a). TXx therefore averages local monthly maxima, rather than identifying the hottest reading anywhere in the country. We pool June-August, giving 90 values per 30-year period. Each value is expressed relative to the 1961-1990 mean of the same country and calendar month, removing differences in seasonal levels. The three observations from a summer remain correlated; Section 5 keeps them together in the bootstrap.</w:t>
       </w:r>
     </w:p>
     <w:p>
@@ -126,12 +126,7 @@
           <w:b w:val="0"/>
           <w:i w:val="0"/>
         </w:rPr>
-        <w:t>The second index is the Standardised Precipitation-Evapotranspiration Index over a six-month window (SPEI-6). For each grid cell, the balance between precipitation and potential evapotranspiration (PET) is accumulated over the preceding six months. It is then transformed, by fitting a probability distribution, into standard deviations from the mean of a reference period of 1971-2005. The Atlas documentation is inconsistent on this point: the dataset documentation gives 1971-2010 (C3S, 2023), while the v2.5 changelog gives 1971-2005 in the context of projections (C3S, 2024a). The Atlas information panel for SPEI-6, however, states explicitly that the reference period is 1971-2005 "for observations, reanalysis, and projections" (verbatim copy in data/atlas_info_spei6.txt), and we report this value. Potential evapotranspiration is computed with the Hargreaves formulation (Hargreaves and Samani, 1985), which the Atlas has used since version 2.0 (C3S, 2024a), implemented with the xclim library (C3S, 2023). The index has no units; negative values indicate conditions drier than the reference climate and positive values wetter ones. As with TXx, the Atlas averages the grid-cell values over each country. We keep only the September value in each year. Because the window is six months long, the September value summarises the water balance from April to September, that is, the whole growing and warm season. Taking one month per year also avoids the strong autocorrelation that consecutive monthly SPEI-6 values would introduce, as they share five of their six months. Each year then contributes one non-overlapping observation of warm-season dryness.</w:t>
-      </w:r>
-    </w:p>
-    <w:p>
-      <w:r>
-        <w:br w:type="page"/>
+        <w:t>SPEI-6 is the Standardised Precipitation-Evapotranspiration Index over six months. It accumulates precipitation minus potential evapotranspiration (PET) at each grid cell, fits a probability distribution and standardises the result. PET uses the Hargreaves formulation, implemented through xclim (Hargreaves and Samani, 1985; C3S, 2023; 2024a). The country average is dimensionless; negative values indicate drier conditions. We retain September only, covering April-September water balance, with 30 observations per comparison period. These annual windows do not overlap, unlike consecutive monthly SPEI-6 values. We adopt the 1971-2005 reference period explicitly stated in the Atlas information panel for observations, reanalysis and projections (data/atlas_info_spei6.txt). The dataset documentation instead reports 1971-2010, while the v2.5 changelog gives 1971-2005 for projections; this inconsistency remains a documentation limitation.</w:t>
       </w:r>
     </w:p>
     <w:p>
@@ -148,7 +143,7 @@
           <w:b w:val="0"/>
           <w:i w:val="0"/>
         </w:rPr>
-        <w:t>These data have several limitations. First, ERA5-Land is a reanalysis, not a set of station observations. It combines a numerical model with assimilated observations, and its representation of extremes depends on the model's physics as well as on the observations. A specific concern affects the start of our sample: the Atlas disables ERA5-Land trends before 1978 because of a potential inconsistency in the ERA5 forcing used for that period (C3S, 2024a). Our early period overlaps these years, so part of any difference between the early and recent distributions could be a data artefact rather than a change in climate.</w:t>
+        <w:t>These data have several limitations. ERA5-Land is a model-based reanalysis, not a collection of station measurements. The Atlas disables trends before 1978 because of potential inconsistency in the ERA5 forcing (C3S, 2024a). Our early comparison period overlaps those years, so early-recent changes may partly reflect data artefacts. The post-1978 check in Section 5 covers mean trends only.</w:t>
       </w:r>
     </w:p>
     <w:p>
@@ -157,34 +152,7 @@
           <w:b w:val="0"/>
           <w:i w:val="0"/>
         </w:rPr>
-        <w:t>Second, averaging over a country smooths local extremes. A heatwave or drought that affects only part of the territory is diluted in the national mean, so our series understate the severity of the most extreme local events, and the smoothing is likely to be stronger for large or climatically diverse countries such as France and Spain. In addition, the Atlas documentation does not state how grid cells that straddle a national border are treated (C3S, 2024a), so the exact spatial footprint of each country average is not known.</w:t>
-      </w:r>
-    </w:p>
-    <w:p>
-      <w:r>
-        <w:rPr>
-          <w:b w:val="0"/>
-          <w:i w:val="0"/>
-        </w:rPr>
-        <w:t>Third, SPEI depends on modelling choices: the reference period sets the zero of the scale, and the PET formulation determines how strongly rising temperatures translate into apparent drying. A different reference period or PET method could shift the series or change their trends.</w:t>
-      </w:r>
-    </w:p>
-    <w:p>
-      <w:r>
-        <w:rPr>
-          <w:b w:val="0"/>
-          <w:i w:val="0"/>
-        </w:rPr>
-        <w:t>Fourth, standardisation is done per grid cell, and averaging standardised values across cells reduces their variance. The country-level SPEI-6 series have standard deviations between 0.754 and 0.902, all below the unit variance of a cell-level index, and their 1950-2025 means are negative, between -0.285 and -0.037. As a result, the Atlas's fixed threshold of -1.5 for "severe" drought is rarely crossed at the country level, and a count of exceedances of that threshold would carry little information. We therefore define extremes with percentile thresholds taken from each country's own distribution.</w:t>
-      </w:r>
-    </w:p>
-    <w:p>
-      <w:r>
-        <w:rPr>
-          <w:b w:val="0"/>
-          <w:i w:val="0"/>
-        </w:rPr>
-        <w:t>Finally, the tails contain few observations by construction. With 76 years per series, or 90 observations per 30-year period for pooled TXx, the 90th or 95th percentile within a period is estimated from only a handful of values. Estimates of tail shape are thus imprecise. Section 5 reports bootstrap intervals that keep the three months of a summer together when resampling; these do not account for dependence across years.</w:t>
+        <w:t>National averaging smooths local extremes, especially in large or diverse countries, and the guide does not specify treatment of cells crossing national borders. SPEI-6 also depends on the PET method and reference period. Its standardisation occurs before spatial averaging: country-level SDs are 0.754-0.902 and full-record means range from -0.285 to -0.037. A country average therefore need not have unit variance or zero mean. We use each country's early-period percentiles rather than the rarely crossed fixed threshold of -1.5. Finally, extreme percentiles rest on few observations. Section 5 reports whole-year bootstrap intervals, which preserve dependence within summers but not across years.</w:t>
       </w:r>
     </w:p>
     <w:p>
@@ -9261,6 +9229,10 @@
     </w:p>
     <w:p>
       <w:r>
+        <w:rPr>
+          <w:b w:val="0"/>
+          <w:i w:val="0"/>
+        </w:rPr>
         <w:t>We used Claude Code and OpenAI Codex for code execution and help with concrete system design. Codex also assisted with formatting of the paper. Numerical statements were checked against the repository's computed outputs. The authors remain responsible for reviewing the submitted text, verifying its references and explaining the methods and results.</w:t>
       </w:r>
     </w:p>

</xml_diff>